<commit_message>
2.106.0: loonplanning - betaald, functie per persoon, vastgestelde afspraak
- loon_planning: betaald + weekdagen; loon_scenario_persoon (functie per persoon per scenario).
- loonplan_analyse: alle seizoensweken, functie scenario > oude weekwaarde > voorstel,
  leeftijd per week, kosten alleen betaald, signaal 'niet_opgegeven', afspraakstatus.
- includes/loonplan_afspraak.php: inzet_afspraak(+_week), inzet_rol_voorstel (Authentik-rang),
  inzet_vaststellen, loonplan_definitief_maken, inzet_effectief, wijkt_af.
- Scherm: definitief-balk, afspraak per persoon (vaststellen/bijwerken), betaald-schakelaar,
  functie per persoon via AJAX; scenario-id uit POST gecontroleerd tegen het seizoen.
- Dekking/bellijst gebruiken de afspraak als die er is. Portaal toont de afspraak na vaststellen.
- bereken_dagloon per verzoek gecachet; seizoen_op_id(); AVG-wis/-export kennen de afspraak.
- Verwerkingsregister bijgewerkt.
</commit_message>
<xml_diff>
--- a/docs/handleiding/word/verwerkingsregister.docx
+++ b/docs/handleiding/word/verwerkingsregister.docx
@@ -5250,19 +5250,19 @@
         <w:rPr>
           <w:lang w:val="nl"/>
         </w:rPr>
-        <w:t xml:space="preserve">wanneer iemand kan werken, verzoeken om minder dagen, correcties van het bestuur</w:t>
-      </w:r>
-      <w:r>
-        <w:rPr>
-          <w:lang w:val="nl"/>
-        </w:rPr>
-        <w:t xml:space="preserve"> </w:t>
-      </w:r>
-      <w:r>
-        <w:rPr>
-          <w:lang w:val="nl"/>
-        </w:rPr>
-        <w:t xml:space="preserve">en de planning met loonkosten.</w:t>
+        <w:t xml:space="preserve">wanneer iemand kan werken, verzoeken om minder dagen, correcties van het bestuur,</w:t>
+      </w:r>
+      <w:r>
+        <w:rPr>
+          <w:lang w:val="nl"/>
+        </w:rPr>
+        <w:t xml:space="preserve"> </w:t>
+      </w:r>
+      <w:r>
+        <w:rPr>
+          <w:lang w:val="nl"/>
+        </w:rPr>
+        <w:t xml:space="preserve">de planning met loonkosten en (na het trainingsweekend) de vastgestelde inzet-afspraak.</w:t>
       </w:r>
     </w:p>
     <w:tbl>
@@ -5333,7 +5333,7 @@
               <w:rPr>
                 <w:lang w:val="nl"/>
               </w:rPr>
-              <w:t xml:space="preserve">Een bezetting van de posten maken en de loonkosten plannen.</w:t>
+              <w:t xml:space="preserve">Een bezetting van de posten maken, de loonkosten plannen en vastleggen wat er per persoon is afgesproken (weken, dagen, betaald of onbetaald, functie) als basis voor contract en loonadministratie.</w:t>
             </w:r>
           </w:p>
         </w:tc>
@@ -5423,7 +5423,7 @@
               <w:rPr>
                 <w:lang w:val="nl"/>
               </w:rPr>
-              <w:t xml:space="preserve">Weken en dagen, vaste vrije dagen met reden, afwezigheid met omschrijving, verzoeken om minder dagen met toelichting, correcties door het bestuur met reden, losse dagen (tabellen</w:t>
+              <w:t xml:space="preserve">Weken en dagen, vaste vrije dagen met reden, afwezigheid met omschrijving, verzoeken om minder dagen met toelichting (en welke dagen iemand wél kan), correcties door het bestuur met reden, losse dagen (tabellen</w:t>
             </w:r>
             <w:r>
               <w:rPr>
@@ -5455,7 +5455,7 @@
               <w:rPr>
                 <w:lang w:val="nl"/>
               </w:rPr>
-              <w:t xml:space="preserve">). Loonplanning: weken, functie, loon, notitie (</w:t>
+              <w:t xml:space="preserve">). Loonplanning: weken, dagen, betaald/onbetaald, functie, loon, notitie (</w:t>
             </w:r>
             <w:r>
               <w:rPr>
@@ -5487,7 +5487,58 @@
               <w:rPr>
                 <w:lang w:val="nl"/>
               </w:rPr>
-              <w:t xml:space="preserve">).</w:t>
+              <w:t xml:space="preserve">,</w:t>
+            </w:r>
+            <w:r>
+              <w:rPr>
+                <w:lang w:val="nl"/>
+              </w:rPr>
+              <w:t xml:space="preserve"> </w:t>
+            </w:r>
+            <w:r>
+              <w:rPr>
+                <w:rStyle w:val="VerbatimChar"/>
+                <w:lang w:val="nl"/>
+              </w:rPr>
+              <w:t xml:space="preserve">loon_scenario_persoon</w:t>
+            </w:r>
+            <w:r>
+              <w:rPr>
+                <w:lang w:val="nl"/>
+              </w:rPr>
+              <w:t xml:space="preserve">). Vastgestelde afspraak: functie, weken, dagen, betaald/onbetaald, wie en wanneer vastgesteld (</w:t>
+            </w:r>
+            <w:r>
+              <w:rPr>
+                <w:rStyle w:val="VerbatimChar"/>
+                <w:lang w:val="nl"/>
+              </w:rPr>
+              <w:t xml:space="preserve">inzet_afspraak</w:t>
+            </w:r>
+            <w:r>
+              <w:rPr>
+                <w:lang w:val="nl"/>
+              </w:rPr>
+              <w:t xml:space="preserve">,</w:t>
+            </w:r>
+            <w:r>
+              <w:rPr>
+                <w:lang w:val="nl"/>
+              </w:rPr>
+              <w:t xml:space="preserve"> </w:t>
+            </w:r>
+            <w:r>
+              <w:rPr>
+                <w:rStyle w:val="VerbatimChar"/>
+                <w:lang w:val="nl"/>
+              </w:rPr>
+              <w:t xml:space="preserve">inzet_afspraak_week</w:t>
+            </w:r>
+            <w:r>
+              <w:rPr>
+                <w:lang w:val="nl"/>
+              </w:rPr>
+              <w:t xml:space="preserve">). De functie wordt voorgesteld uit de Lifeguard-rang in Authentik (zie Authentik).</w:t>
             </w:r>
           </w:p>
         </w:tc>
@@ -5581,7 +5632,7 @@
               <w:rPr>
                 <w:lang w:val="nl"/>
               </w:rPr>
-              <w:t xml:space="preserve">, alleen lezen). Google (Gemini) alleen voor de AI-hulp.</w:t>
+              <w:t xml:space="preserve">, alleen lezen). De sollicitant ziet de eigen afspraak in het portaal zodra die is vastgesteld. Google (Gemini) alleen voor de AI-hulp.</w:t>
             </w:r>
           </w:p>
         </w:tc>
@@ -5725,7 +5776,7 @@
               <w:rPr>
                 <w:lang w:val="nl"/>
               </w:rPr>
-              <w:t xml:space="preserve">, standaard 3). Loonplanning blijft zonder notitie staan en is na anonimiseren niet meer herleidbaar.</w:t>
+              <w:t xml:space="preserve">, standaard 3). Loonplanning en vastgestelde afspraak blijven zonder notitie staan en zijn na anonimiseren niet meer herleidbaar.</w:t>
             </w:r>
           </w:p>
         </w:tc>

</xml_diff>

<commit_message>
2.127.0: seintje buiten het seizoen, koppeling Vandaag/seizoen
- Aanmelding dicht: seintje-formulier (voornaam + e-mail + toestemming) i.p.v. een dood einde, op aanmelden.php, wervingspagina's en de WordPress-plugin
- Dubbele bevestiging: mail met link, bevestigen met een knop (POST, mailscanners veilig), token als hash; tabel werving_seintje
- Berichten › Seintje gevraagd: ontdubbeld, eigen afmeldlink, verstuurd_op; Vandaag-werkbak en tussenscherm Aanmelding openen tonen het aantal wachtenden
- Opschonen: onbevestigd na 7 dagen, na het openingsbericht of na de seintjetermijn; privacyverklaring (PRIVACY_VERSIE 2026-09e), verwerkingsregister, handleiding beheer
- Logboeklabels; APP_VERSIE 2.127.0 (nieuwe tabel en kolom)
</commit_message>
<xml_diff>
--- a/docs/handleiding/word/verwerkingsregister.docx
+++ b/docs/handleiding/word/verwerkingsregister.docx
@@ -1813,6 +1813,50 @@
           </w:p>
         </w:tc>
       </w:tr>
+      <w:tr>
+        <w:tc>
+          <w:tcPr/>
+          <w:p>
+            <w:pPr>
+              <w:pStyle w:val="Compact"/>
+            </w:pPr>
+            <w:r>
+              <w:rPr>
+                <w:lang w:val="nl"/>
+              </w:rPr>
+              <w:t xml:space="preserve">Seintje buiten het seizoen (nog niet gesolliciteerd)</w:t>
+            </w:r>
+          </w:p>
+        </w:tc>
+        <w:tc>
+          <w:tcPr/>
+          <w:p>
+            <w:pPr>
+              <w:pStyle w:val="Compact"/>
+            </w:pPr>
+            <w:r>
+              <w:rPr>
+                <w:lang w:val="nl"/>
+              </w:rPr>
+              <w:t xml:space="preserve">art. 6 lid 1 sub a, met dubbele bevestiging</w:t>
+            </w:r>
+          </w:p>
+        </w:tc>
+        <w:tc>
+          <w:tcPr/>
+          <w:p>
+            <w:pPr>
+              <w:pStyle w:val="Compact"/>
+            </w:pPr>
+            <w:r>
+              <w:rPr>
+                <w:lang w:val="nl"/>
+              </w:rPr>
+              <w:t xml:space="preserve">onbevestigd 7 dagen; na het bericht weg; maximaal 12 maanden</w:t>
+            </w:r>
+          </w:p>
+        </w:tc>
+      </w:tr>
     </w:tbl>
     <w:bookmarkEnd w:id="11"/>
     <w:bookmarkStart w:id="12" w:name="hosting-en-vaste-verwerkers"/>
@@ -9986,6 +10030,527 @@
         </w:tc>
       </w:tr>
     </w:tbl>
+    <w:p>
+      <w:pPr>
+        <w:pStyle w:val="BodyText"/>
+      </w:pPr>
+      <w:r>
+        <w:rPr>
+          <w:b/>
+          <w:bCs/>
+          <w:lang w:val="nl"/>
+        </w:rPr>
+        <w:t xml:space="preserve">Seintje buiten het seizoen.</w:t>
+      </w:r>
+      <w:r>
+        <w:rPr>
+          <w:lang w:val="nl"/>
+        </w:rPr>
+        <w:t xml:space="preserve"> </w:t>
+      </w:r>
+      <w:r>
+        <w:rPr>
+          <w:lang w:val="nl"/>
+        </w:rPr>
+        <w:t xml:space="preserve">Staat de aanmelding dicht, dan tonen het aanmeldformulier, de</w:t>
+      </w:r>
+      <w:r>
+        <w:rPr>
+          <w:lang w:val="nl"/>
+        </w:rPr>
+        <w:t xml:space="preserve"> </w:t>
+      </w:r>
+      <w:r>
+        <w:rPr>
+          <w:lang w:val="nl"/>
+        </w:rPr>
+        <w:t xml:space="preserve">wervingspagina's en het formulier op paal13.com een klein formulier: "laat je e-mailadres achter,</w:t>
+      </w:r>
+      <w:r>
+        <w:rPr>
+          <w:lang w:val="nl"/>
+        </w:rPr>
+        <w:t xml:space="preserve"> </w:t>
+      </w:r>
+      <w:r>
+        <w:rPr>
+          <w:lang w:val="nl"/>
+        </w:rPr>
+        <w:t xml:space="preserve">dan sturen we je één bericht zodra je je kunt aanmelden" (</w:t>
+      </w:r>
+      <w:r>
+        <w:rPr>
+          <w:rStyle w:val="VerbatimChar"/>
+          <w:lang w:val="nl"/>
+        </w:rPr>
+        <w:t xml:space="preserve">includes/seintje_werving.php</w:t>
+      </w:r>
+      <w:r>
+        <w:rPr>
+          <w:lang w:val="nl"/>
+        </w:rPr>
+        <w:t xml:space="preserve">).</w:t>
+      </w:r>
+    </w:p>
+    <w:tbl>
+      <w:tblPr>
+        <w:tblStyle w:val="Table"/>
+        <w:tblW w:type="auto" w:w="0"/>
+        <w:tblLook w:firstRow="1" w:lastRow="0" w:firstColumn="0" w:lastColumn="0" w:noHBand="0" w:noVBand="0" w:val="0020"/>
+      </w:tblPr>
+      <w:tblGrid>
+        <w:gridCol w:w="3960"/>
+        <w:gridCol w:w="3960"/>
+      </w:tblGrid>
+      <w:tr>
+        <w:trPr>
+          <w:tblHeader w:val="on"/>
+        </w:trPr>
+        <w:tc>
+          <w:tcPr/>
+          <w:p>
+            <w:pPr>
+              <w:pStyle w:val="Compact"/>
+            </w:pPr>
+            <w:r>
+              <w:rPr>
+                <w:lang w:val="nl"/>
+              </w:rPr>
+              <w:t xml:space="preserve">Onderdeel</w:t>
+            </w:r>
+          </w:p>
+        </w:tc>
+        <w:tc>
+          <w:tcPr/>
+          <w:p>
+            <w:pPr>
+              <w:pStyle w:val="Compact"/>
+            </w:pPr>
+            <w:r>
+              <w:rPr>
+                <w:lang w:val="nl"/>
+              </w:rPr>
+              <w:t xml:space="preserve">Inhoud</w:t>
+            </w:r>
+          </w:p>
+        </w:tc>
+      </w:tr>
+      <w:tr>
+        <w:tc>
+          <w:tcPr/>
+          <w:p>
+            <w:pPr>
+              <w:pStyle w:val="Compact"/>
+            </w:pPr>
+            <w:r>
+              <w:rPr>
+                <w:lang w:val="nl"/>
+              </w:rPr>
+              <w:t xml:space="preserve">Doel</w:t>
+            </w:r>
+          </w:p>
+        </w:tc>
+        <w:tc>
+          <w:tcPr/>
+          <w:p>
+            <w:pPr>
+              <w:pStyle w:val="Compact"/>
+            </w:pPr>
+            <w:r>
+              <w:rPr>
+                <w:lang w:val="nl"/>
+              </w:rPr>
+              <w:t xml:space="preserve">Mensen die nog niet solliciteerden één bericht sturen als de aanmelding opengaat.</w:t>
+            </w:r>
+          </w:p>
+        </w:tc>
+      </w:tr>
+      <w:tr>
+        <w:tc>
+          <w:tcPr/>
+          <w:p>
+            <w:pPr>
+              <w:pStyle w:val="Compact"/>
+            </w:pPr>
+            <w:r>
+              <w:rPr>
+                <w:lang w:val="nl"/>
+              </w:rPr>
+              <w:t xml:space="preserve">Grondslag</w:t>
+            </w:r>
+          </w:p>
+        </w:tc>
+        <w:tc>
+          <w:tcPr/>
+          <w:p>
+            <w:pPr>
+              <w:pStyle w:val="Compact"/>
+            </w:pPr>
+            <w:r>
+              <w:rPr>
+                <w:lang w:val="nl"/>
+              </w:rPr>
+              <w:t xml:space="preserve">Art. 6 lid 1 sub a AVG, toestemming: een apart, niet vooraf aangevinkt vakje "Ja, stuur me één bericht als de werving opent", met de privacyverklaring erbij. Dubbele bevestiging (double opt-in): pas na de klik in de bevestigingsmail staat het seintje aan, want iedereen kan elk adres invullen (AVG art. 7 lid 1 aantoonbaarheid, Telecommunicatiewet art. 11.7).</w:t>
+            </w:r>
+          </w:p>
+        </w:tc>
+      </w:tr>
+      <w:tr>
+        <w:tc>
+          <w:tcPr/>
+          <w:p>
+            <w:pPr>
+              <w:pStyle w:val="Compact"/>
+            </w:pPr>
+            <w:r>
+              <w:rPr>
+                <w:lang w:val="nl"/>
+              </w:rPr>
+              <w:t xml:space="preserve">Betrokkenen</w:t>
+            </w:r>
+          </w:p>
+        </w:tc>
+        <w:tc>
+          <w:tcPr/>
+          <w:p>
+            <w:pPr>
+              <w:pStyle w:val="Compact"/>
+            </w:pPr>
+            <w:r>
+              <w:rPr>
+                <w:lang w:val="nl"/>
+              </w:rPr>
+              <w:t xml:space="preserve">Bezoekers van het aanmeldformulier, een wervingspagina of paal13.com buiten de aanmeldperiode.</w:t>
+            </w:r>
+          </w:p>
+        </w:tc>
+      </w:tr>
+      <w:tr>
+        <w:tc>
+          <w:tcPr/>
+          <w:p>
+            <w:pPr>
+              <w:pStyle w:val="Compact"/>
+            </w:pPr>
+            <w:r>
+              <w:rPr>
+                <w:lang w:val="nl"/>
+              </w:rPr>
+              <w:t xml:space="preserve">Persoonsgegevens</w:t>
+            </w:r>
+          </w:p>
+        </w:tc>
+        <w:tc>
+          <w:tcPr/>
+          <w:p>
+            <w:pPr>
+              <w:pStyle w:val="Compact"/>
+            </w:pPr>
+            <w:r>
+              <w:rPr>
+                <w:lang w:val="nl"/>
+              </w:rPr>
+              <w:t xml:space="preserve">Voornaam, e-mailadres, bron (pagina of campagne, voor de statistiek), moment van aanvragen, bevestigen en versturen, en een token (alleen als sha256-hash). Tabel</w:t>
+            </w:r>
+            <w:r>
+              <w:rPr>
+                <w:lang w:val="nl"/>
+              </w:rPr>
+              <w:t xml:space="preserve"> </w:t>
+            </w:r>
+            <w:r>
+              <w:rPr>
+                <w:rStyle w:val="VerbatimChar"/>
+                <w:lang w:val="nl"/>
+              </w:rPr>
+              <w:t xml:space="preserve">werving_seintje</w:t>
+            </w:r>
+            <w:r>
+              <w:rPr>
+                <w:lang w:val="nl"/>
+              </w:rPr>
+              <w:t xml:space="preserve">. Het IP-adres komt alleen in het logboek (bevestigen, intrekken) en in de snelheidsbegrenzing, niet in de tabel.</w:t>
+            </w:r>
+          </w:p>
+        </w:tc>
+      </w:tr>
+      <w:tr>
+        <w:tc>
+          <w:tcPr/>
+          <w:p>
+            <w:pPr>
+              <w:pStyle w:val="Compact"/>
+            </w:pPr>
+            <w:r>
+              <w:rPr>
+                <w:lang w:val="nl"/>
+              </w:rPr>
+              <w:t xml:space="preserve">Ontvangers en verwerkers</w:t>
+            </w:r>
+          </w:p>
+        </w:tc>
+        <w:tc>
+          <w:tcPr/>
+          <w:p>
+            <w:pPr>
+              <w:pStyle w:val="Compact"/>
+            </w:pPr>
+            <w:r>
+              <w:rPr>
+                <w:lang w:val="nl"/>
+              </w:rPr>
+              <w:t xml:space="preserve">Bestuur (module</w:t>
+            </w:r>
+            <w:r>
+              <w:rPr>
+                <w:lang w:val="nl"/>
+              </w:rPr>
+              <w:t xml:space="preserve"> </w:t>
+            </w:r>
+            <w:r>
+              <w:rPr>
+                <w:rStyle w:val="VerbatimChar"/>
+                <w:lang w:val="nl"/>
+              </w:rPr>
+              <w:t xml:space="preserve">mailing</w:t>
+            </w:r>
+            <w:r>
+              <w:rPr>
+                <w:lang w:val="nl"/>
+              </w:rPr>
+              <w:t xml:space="preserve">, Berichten › groep Seintje gevraagd). E-mailprovider. Alleen e-mail; geen WhatsApp of sms (geen telefoonnummer).</w:t>
+            </w:r>
+          </w:p>
+        </w:tc>
+      </w:tr>
+      <w:tr>
+        <w:tc>
+          <w:tcPr/>
+          <w:p>
+            <w:pPr>
+              <w:pStyle w:val="Compact"/>
+            </w:pPr>
+            <w:r>
+              <w:rPr>
+                <w:lang w:val="nl"/>
+              </w:rPr>
+              <w:t xml:space="preserve">Doorgifte buiten de EER</w:t>
+            </w:r>
+          </w:p>
+        </w:tc>
+        <w:tc>
+          <w:tcPr/>
+          <w:p>
+            <w:pPr>
+              <w:pStyle w:val="Compact"/>
+            </w:pPr>
+            <w:r>
+              <w:rPr>
+                <w:lang w:val="nl"/>
+              </w:rPr>
+              <w:t xml:space="preserve">Nee.</w:t>
+            </w:r>
+          </w:p>
+        </w:tc>
+      </w:tr>
+      <w:tr>
+        <w:tc>
+          <w:tcPr/>
+          <w:p>
+            <w:pPr>
+              <w:pStyle w:val="Compact"/>
+            </w:pPr>
+            <w:r>
+              <w:rPr>
+                <w:lang w:val="nl"/>
+              </w:rPr>
+              <w:t xml:space="preserve">Bewaartermijn</w:t>
+            </w:r>
+          </w:p>
+        </w:tc>
+        <w:tc>
+          <w:tcPr/>
+          <w:p>
+            <w:pPr>
+              <w:pStyle w:val="Compact"/>
+            </w:pPr>
+            <w:r>
+              <w:rPr>
+                <w:lang w:val="nl"/>
+              </w:rPr>
+              <w:t xml:space="preserve">Onbevestigd: 7 dagen, daarna weg (altijd, ook met</w:t>
+            </w:r>
+            <w:r>
+              <w:rPr>
+                <w:lang w:val="nl"/>
+              </w:rPr>
+              <w:t xml:space="preserve"> </w:t>
+            </w:r>
+            <w:r>
+              <w:rPr>
+                <w:rStyle w:val="VerbatimChar"/>
+                <w:lang w:val="nl"/>
+              </w:rPr>
+              <w:t xml:space="preserve">bewaar.actief</w:t>
+            </w:r>
+            <w:r>
+              <w:rPr>
+                <w:lang w:val="nl"/>
+              </w:rPr>
+              <w:t xml:space="preserve"> </w:t>
+            </w:r>
+            <w:r>
+              <w:rPr>
+                <w:lang w:val="nl"/>
+              </w:rPr>
+              <w:t xml:space="preserve">uit: zonder bevestiging is er geen toestemming). Bevestigd: tot het openingsbericht is verstuurd (een dag later weg), en uiterlijk</w:t>
+            </w:r>
+            <w:r>
+              <w:rPr>
+                <w:lang w:val="nl"/>
+              </w:rPr>
+              <w:t xml:space="preserve"> </w:t>
+            </w:r>
+            <w:r>
+              <w:rPr>
+                <w:rStyle w:val="VerbatimChar"/>
+                <w:lang w:val="nl"/>
+              </w:rPr>
+              <w:t xml:space="preserve">bewaar.seintje_mnd</w:t>
+            </w:r>
+            <w:r>
+              <w:rPr>
+                <w:lang w:val="nl"/>
+              </w:rPr>
+              <w:t xml:space="preserve"> </w:t>
+            </w:r>
+            <w:r>
+              <w:rPr>
+                <w:lang w:val="nl"/>
+              </w:rPr>
+              <w:t xml:space="preserve">maanden (standaard en maximaal 12) na de bevestiging. Intrekken: meteen weg.</w:t>
+            </w:r>
+          </w:p>
+        </w:tc>
+      </w:tr>
+      <w:tr>
+        <w:tc>
+          <w:tcPr/>
+          <w:p>
+            <w:pPr>
+              <w:pStyle w:val="Compact"/>
+            </w:pPr>
+            <w:r>
+              <w:rPr>
+                <w:lang w:val="nl"/>
+              </w:rPr>
+              <w:t xml:space="preserve">Intrekken</w:t>
+            </w:r>
+          </w:p>
+        </w:tc>
+        <w:tc>
+          <w:tcPr/>
+          <w:p>
+            <w:pPr>
+              <w:pStyle w:val="Compact"/>
+            </w:pPr>
+            <w:r>
+              <w:rPr>
+                <w:lang w:val="nl"/>
+              </w:rPr>
+              <w:t xml:space="preserve">De link in de bevestigingsmail en de afmeldlink onder het openingsbericht leiden naar</w:t>
+            </w:r>
+            <w:r>
+              <w:rPr>
+                <w:lang w:val="nl"/>
+              </w:rPr>
+              <w:t xml:space="preserve"> </w:t>
+            </w:r>
+            <w:r>
+              <w:rPr>
+                <w:rStyle w:val="VerbatimChar"/>
+                <w:lang w:val="nl"/>
+              </w:rPr>
+              <w:t xml:space="preserve">/seintje.php</w:t>
+            </w:r>
+            <w:r>
+              <w:rPr>
+                <w:lang w:val="nl"/>
+              </w:rPr>
+              <w:t xml:space="preserve"> </w:t>
+            </w:r>
+            <w:r>
+              <w:rPr>
+                <w:lang w:val="nl"/>
+              </w:rPr>
+              <w:t xml:space="preserve">met de knop "Toch geen seintje"; die verwijdert de rij direct (art. 7 lid 3).</w:t>
+            </w:r>
+          </w:p>
+        </w:tc>
+      </w:tr>
+      <w:tr>
+        <w:tc>
+          <w:tcPr/>
+          <w:p>
+            <w:pPr>
+              <w:pStyle w:val="Compact"/>
+            </w:pPr>
+            <w:r>
+              <w:rPr>
+                <w:lang w:val="nl"/>
+              </w:rPr>
+              <w:t xml:space="preserve">Beveiliging</w:t>
+            </w:r>
+          </w:p>
+        </w:tc>
+        <w:tc>
+          <w:tcPr/>
+          <w:p>
+            <w:pPr>
+              <w:pStyle w:val="Compact"/>
+            </w:pPr>
+            <w:r>
+              <w:rPr>
+                <w:lang w:val="nl"/>
+              </w:rPr>
+              <w:t xml:space="preserve">Anti-bot-token (wervingspagina, paal13.com) of csrf (</w:t>
+            </w:r>
+            <w:r>
+              <w:rPr>
+                <w:rStyle w:val="VerbatimChar"/>
+                <w:lang w:val="nl"/>
+              </w:rPr>
+              <w:t xml:space="preserve">/aanmelden.php</w:t>
+            </w:r>
+            <w:r>
+              <w:rPr>
+                <w:lang w:val="nl"/>
+              </w:rPr>
+              <w:t xml:space="preserve">), honeypot, maximaal 10 aanvragen per uur per IP-adres en maximaal 3 bevestigingsmails per adres per dag. Bevestigen en intrekken alleen met een knop die post, niet op een GET (mailscanners). Het scherm verklapt nooit of een adres al bekend is. De bevestigingsmail wordt niet gelogd (</w:t>
+            </w:r>
+            <w:r>
+              <w:rPr>
+                <w:rStyle w:val="VerbatimChar"/>
+                <w:lang w:val="nl"/>
+              </w:rPr>
+              <w:t xml:space="preserve">body_loggen</w:t>
+            </w:r>
+            <w:r>
+              <w:rPr>
+                <w:lang w:val="nl"/>
+              </w:rPr>
+              <w:t xml:space="preserve"> </w:t>
+            </w:r>
+            <w:r>
+              <w:rPr>
+                <w:lang w:val="nl"/>
+              </w:rPr>
+              <w:t xml:space="preserve">uit).</w:t>
+            </w:r>
+          </w:p>
+        </w:tc>
+      </w:tr>
+    </w:tbl>
     <w:bookmarkEnd w:id="25"/>
     <w:bookmarkStart w:id="26" w:name="bijzonderheden"/>
     <w:p>
@@ -10774,7 +11339,7 @@
               <w:rPr>
                 <w:lang w:val="nl"/>
               </w:rPr>
-              <w:t xml:space="preserve">Seintje: afmeldlink of de knop in het portaal. Foto's: per mail. Wat al gebeurde blijft rechtmatig.</w:t>
+              <w:t xml:space="preserve">Seintje: afmeldlink of de knop in het portaal. Seintje buiten het seizoen: de knop "Toch geen seintje" achter de link in de mail (gegevens meteen weg). Foto's: per mail. Wat al gebeurde blijft rechtmatig.</w:t>
             </w:r>
           </w:p>
         </w:tc>
@@ -11670,6 +12235,55 @@
                 <w:lang w:val="nl"/>
               </w:rPr>
               <w:t xml:space="preserve">Selectiedag en trainingsweekend: bevestiging "ik kom / ik kan niet" met reden, het gesprek met het bestuur (besluit, interne notitie, bericht aan de sollicitant), vergrendeling "bezig door" en de incheck-tablet met foto. Alles zit in de inzage en gaat mee bij wissen.</w:t>
+            </w:r>
+          </w:p>
+        </w:tc>
+      </w:tr>
+      <w:tr>
+        <w:tc>
+          <w:tcPr/>
+          <w:p>
+            <w:pPr>
+              <w:pStyle w:val="Compact"/>
+            </w:pPr>
+            <w:r>
+              <w:rPr>
+                <w:lang w:val="nl"/>
+              </w:rPr>
+              <w:t xml:space="preserve">27 september 2026</w:t>
+            </w:r>
+          </w:p>
+        </w:tc>
+        <w:tc>
+          <w:tcPr/>
+          <w:p>
+            <w:pPr>
+              <w:pStyle w:val="Compact"/>
+            </w:pPr>
+            <w:r>
+              <w:rPr>
+                <w:lang w:val="nl"/>
+              </w:rPr>
+              <w:t xml:space="preserve">Seintje buiten het seizoen: wie nog niet solliciteerde kan bij een gesloten aanmelding om één bericht vragen (voornaam, e-mail, bron; dubbele bevestiging; onbevestigd 7 dagen, daarna tot het bericht en maximaal 12 maanden). Tabel</w:t>
+            </w:r>
+            <w:r>
+              <w:rPr>
+                <w:lang w:val="nl"/>
+              </w:rPr>
+              <w:t xml:space="preserve"> </w:t>
+            </w:r>
+            <w:r>
+              <w:rPr>
+                <w:rStyle w:val="VerbatimChar"/>
+                <w:lang w:val="nl"/>
+              </w:rPr>
+              <w:t xml:space="preserve">werving_seintje</w:t>
+            </w:r>
+            <w:r>
+              <w:rPr>
+                <w:lang w:val="nl"/>
+              </w:rPr>
+              <w:t xml:space="preserve">; privacyverklaring bijgewerkt.</w:t>
             </w:r>
           </w:p>
         </w:tc>

</xml_diff>

<commit_message>
2.128.0: veilig uitrollen - back-up voor elke update, generale repetitie, versielabels
- includes/backup.php: volledige dump (.sql.gz, buiten de webroot, 0600, laatste 3 + max 30 dagen)
- db_failsafe(): bij een versiewissel eerst backup_maak(); op productie zonder geslaagde back-up geen update (P13-D001, check rood, volgend verzoek opnieuw); GET_LOCK zodat de update niet dubbel draait
- health: check 'Back-up voor updates'; testmodus verplicht op test
- tools/anonimiseer_testkopie.php (+ .htaccess): productiekopie op test pseudonimiseren, weigert op productie/zonder MAIL_OMLEIDEN/zonder --ja, eindscan op achtergebleven e-mail/telefoon/IBAN
- .github/workflows/versielabel.yml: tag v<APP_VERSIE> bij elke push naar main
- Runbook: config voor uitrollen, automatische back-up en terugzetten, terugdraaien per label, regels voor database-wijzigingen, generale repetitie; verwerkingsregister: productiekopie op test
</commit_message>
<xml_diff>
--- a/docs/handleiding/word/verwerkingsregister.docx
+++ b/docs/handleiding/word/verwerkingsregister.docx
@@ -373,6 +373,24 @@
           <w:numId w:val="1001"/>
         </w:numPr>
       </w:pPr>
+      <w:hyperlink w:anchor="productiekopie-op-de-testomgeving">
+        <w:r>
+          <w:rPr>
+            <w:rStyle w:val="Hyperlink"/>
+            <w:lang w:val="nl"/>
+          </w:rPr>
+          <w:t xml:space="preserve">Productiekopie op de testomgeving</w:t>
+        </w:r>
+      </w:hyperlink>
+    </w:p>
+    <w:p>
+      <w:pPr>
+        <w:pStyle w:val="Compact"/>
+        <w:numPr>
+          <w:ilvl w:val="0"/>
+          <w:numId w:val="1001"/>
+        </w:numPr>
+      </w:pPr>
       <w:hyperlink w:anchor="seintje-bij-de-volgende-werving">
         <w:r>
           <w:rPr>
@@ -1780,6 +1798,50 @@
               <w:rPr>
                 <w:lang w:val="nl"/>
               </w:rPr>
+              <w:t xml:space="preserve">Productiekopie op de testomgeving</w:t>
+            </w:r>
+          </w:p>
+        </w:tc>
+        <w:tc>
+          <w:tcPr/>
+          <w:p>
+            <w:pPr>
+              <w:pStyle w:val="Compact"/>
+            </w:pPr>
+            <w:r>
+              <w:rPr>
+                <w:lang w:val="nl"/>
+              </w:rPr>
+              <w:t xml:space="preserve">art. 6 lid 1 sub f en art. 32</w:t>
+            </w:r>
+          </w:p>
+        </w:tc>
+        <w:tc>
+          <w:tcPr/>
+          <w:p>
+            <w:pPr>
+              <w:pStyle w:val="Compact"/>
+            </w:pPr>
+            <w:r>
+              <w:rPr>
+                <w:lang w:val="nl"/>
+              </w:rPr>
+              <w:t xml:space="preserve">echte gegevens alleen de minuten tussen importeren en anonimiseren; exportbestand direct weg</w:t>
+            </w:r>
+          </w:p>
+        </w:tc>
+      </w:tr>
+      <w:tr>
+        <w:tc>
+          <w:tcPr/>
+          <w:p>
+            <w:pPr>
+              <w:pStyle w:val="Compact"/>
+            </w:pPr>
+            <w:r>
+              <w:rPr>
+                <w:lang w:val="nl"/>
+              </w:rPr>
               <w:t xml:space="preserve">Seintje bij de volgende werving</w:t>
             </w:r>
           </w:p>
@@ -9593,7 +9655,7 @@
       </w:tr>
     </w:tbl>
     <w:bookmarkEnd w:id="24"/>
-    <w:bookmarkStart w:id="25" w:name="seintje-bij-de-volgende-werving"/>
+    <w:bookmarkStart w:id="25" w:name="productiekopie-op-de-testomgeving"/>
     <w:p>
       <w:pPr>
         <w:pStyle w:val="Heading1"/>
@@ -9602,7 +9664,7 @@
         <w:rPr>
           <w:lang w:val="nl"/>
         </w:rPr>
-        <w:t xml:space="preserve">Seintje bij de volgende werving</w:t>
+        <w:t xml:space="preserve">Productiekopie op de testomgeving</w:t>
       </w:r>
     </w:p>
     <w:p>
@@ -9627,7 +9689,7 @@
         <w:rPr>
           <w:lang w:val="nl"/>
         </w:rPr>
-        <w:t xml:space="preserve">een afgewezen sollicitant kan met één knop vragen om bericht als we weer mensen</w:t>
+        <w:t xml:space="preserve">vóór elke productie-uitrol gaat een kopie van de productiedatabase naar de</w:t>
       </w:r>
       <w:r>
         <w:rPr>
@@ -9639,7 +9701,31 @@
         <w:rPr>
           <w:lang w:val="nl"/>
         </w:rPr>
-        <w:t xml:space="preserve">zoeken. Dat is toestemming, apart gegeven en net zo makkelijk in te trekken.</w:t>
+        <w:t xml:space="preserve">testomgeving (zelfde hoster) en wordt die meteen geanonimiseerd. De echte gegevens staan daar</w:t>
+      </w:r>
+      <w:r>
+        <w:rPr>
+          <w:lang w:val="nl"/>
+        </w:rPr>
+        <w:t xml:space="preserve"> </w:t>
+      </w:r>
+      <w:r>
+        <w:rPr>
+          <w:lang w:val="nl"/>
+        </w:rPr>
+        <w:t xml:space="preserve">alleen de paar minuten tussen importeren en anonimiseren; het exportbestand wordt direct</w:t>
+      </w:r>
+      <w:r>
+        <w:rPr>
+          <w:lang w:val="nl"/>
+        </w:rPr>
+        <w:t xml:space="preserve"> </w:t>
+      </w:r>
+      <w:r>
+        <w:rPr>
+          <w:lang w:val="nl"/>
+        </w:rPr>
+        <w:t xml:space="preserve">weggegooid.</w:t>
       </w:r>
     </w:p>
     <w:tbl>
@@ -9710,7 +9796,7 @@
               <w:rPr>
                 <w:lang w:val="nl"/>
               </w:rPr>
-              <w:t xml:space="preserve">Afgewezen sollicitanten die dat willen, benaderen bij een volgende werving.</w:t>
+              <w:t xml:space="preserve">Een nieuwe versie testen tegen de echte opbouw en aantallen van productie ("generale repetitie"), zodat fouten niet pas op productie en bij echte sollicitanten optreden.</w:t>
             </w:r>
           </w:p>
         </w:tc>
@@ -9740,7 +9826,7 @@
               <w:rPr>
                 <w:lang w:val="nl"/>
               </w:rPr>
-              <w:t xml:space="preserve">Art. 6 lid 1 sub a AVG, toestemming, los gegeven (art. 7) en vereist voor ongevraagde berichten (Telecommunicatiewet art. 11.7). Oud-strandwachten (ooit aangenomen) benaderen we op grond van gerechtvaardigd belang (art. 6 lid 1 sub f), met een afmeldlink als bezwaarmogelijkheid; dat staat in de privacyverklaring.</w:t>
+              <w:t xml:space="preserve">Art. 6 lid 1 sub f AVG (gerechtvaardigd belang: een betrouwbaar systeem) en art. 32 (testen hoort bij passende beveiliging). Het gebruik is verenigbaar met het oorspronkelijke doel (art. 6 lid 4): zelfde verantwoordelijke, zelfde hoster, kort, en direct geanonimiseerd.</w:t>
             </w:r>
           </w:p>
         </w:tc>
@@ -9770,7 +9856,7 @@
               <w:rPr>
                 <w:lang w:val="nl"/>
               </w:rPr>
-              <w:t xml:space="preserve">Afgewezen sollicitanten; oud-strandwachten.</w:t>
+              <w:t xml:space="preserve">Alle betrokkenen van wie gegevens in de productiedatabase staan.</w:t>
             </w:r>
           </w:p>
         </w:tc>
@@ -9800,39 +9886,45 @@
               <w:rPr>
                 <w:lang w:val="nl"/>
               </w:rPr>
-              <w:t xml:space="preserve">Moment en bron van de toestemming (</w:t>
-            </w:r>
-            <w:r>
-              <w:rPr>
-                <w:rStyle w:val="VerbatimChar"/>
-                <w:lang w:val="nl"/>
-              </w:rPr>
-              <w:t xml:space="preserve">personen.seintje_op</w:t>
-            </w:r>
-            <w:r>
-              <w:rPr>
-                <w:lang w:val="nl"/>
-              </w:rPr>
-              <w:t xml:space="preserve">,</w:t>
-            </w:r>
-            <w:r>
-              <w:rPr>
-                <w:lang w:val="nl"/>
-              </w:rPr>
-              <w:t xml:space="preserve"> </w:t>
-            </w:r>
-            <w:r>
-              <w:rPr>
-                <w:rStyle w:val="VerbatimChar"/>
-                <w:lang w:val="nl"/>
-              </w:rPr>
-              <w:t xml:space="preserve">seintje_bron</w:t>
-            </w:r>
-            <w:r>
-              <w:rPr>
-                <w:lang w:val="nl"/>
-              </w:rPr>
-              <w:t xml:space="preserve">), afmeldtoken, en de gegevens van het dossier die zolang blijven staan.</w:t>
+              <w:t xml:space="preserve">Tijdelijk de hele database. Daarna vervangt</w:t>
+            </w:r>
+            <w:r>
+              <w:rPr>
+                <w:lang w:val="nl"/>
+              </w:rPr>
+              <w:t xml:space="preserve"> </w:t>
+            </w:r>
+            <w:r>
+              <w:rPr>
+                <w:rStyle w:val="VerbatimChar"/>
+                <w:lang w:val="nl"/>
+              </w:rPr>
+              <w:t xml:space="preserve">tools/anonimiseer_testkopie.php</w:t>
+            </w:r>
+            <w:r>
+              <w:rPr>
+                <w:lang w:val="nl"/>
+              </w:rPr>
+              <w:t xml:space="preserve"> </w:t>
+            </w:r>
+            <w:r>
+              <w:rPr>
+                <w:lang w:val="nl"/>
+              </w:rPr>
+              <w:t xml:space="preserve">namen, e-mailadressen, telefoonnummers, adressen, vrije teksten, berichtinhoud, IP-adressen en browsers door nepwaarden; geboortedatums schuiven hooguit een half jaar; handtekeningen, versleutelde BSN/IBAN-velden, formulierantwoorden en foto's gaan weg; inlogcodes, tokens en wachtrijen worden geleegd; sleutels van koppelingen worden leeggemaakt of vernieuwd. De bestanden in de kluis (</w:t>
+            </w:r>
+            <w:r>
+              <w:rPr>
+                <w:rStyle w:val="VerbatimChar"/>
+                <w:lang w:val="nl"/>
+              </w:rPr>
+              <w:t xml:space="preserve">DOCUMENTEN_MAP</w:t>
+            </w:r>
+            <w:r>
+              <w:rPr>
+                <w:lang w:val="nl"/>
+              </w:rPr>
+              <w:t xml:space="preserve">) en de kluissleutel van productie gaan niet mee, dus documenten zijn op test onleesbaar. Wat blijft: fases, seizoenen, data van aanmelden en ondertekenen, aantallen en instellingen. Strikt genomen is dat pseudonimisering, geen volledige anonimisering: met kennis van buiten (wie wanneer solliciteerde) is een rij soms nog te herleiden.</w:t>
             </w:r>
           </w:p>
         </w:tc>
@@ -9862,26 +9954,32 @@
               <w:rPr>
                 <w:lang w:val="nl"/>
               </w:rPr>
-              <w:t xml:space="preserve">Bestuur (module</w:t>
-            </w:r>
-            <w:r>
-              <w:rPr>
-                <w:lang w:val="nl"/>
-              </w:rPr>
-              <w:t xml:space="preserve"> </w:t>
-            </w:r>
-            <w:r>
-              <w:rPr>
-                <w:rStyle w:val="VerbatimChar"/>
-                <w:lang w:val="nl"/>
-              </w:rPr>
-              <w:t xml:space="preserve">mailing</w:t>
-            </w:r>
-            <w:r>
-              <w:rPr>
-                <w:lang w:val="nl"/>
-              </w:rPr>
-              <w:t xml:space="preserve">). E-mailprovider, eventueel WhatsReach of sms-dienst.</w:t>
+              <w:t xml:space="preserve">Alleen de technisch beheerder en wie toegang heeft tot het beheer van test. Cloud86 (zelfde hoster als productie). Geen externe diensten: WhatsApp en sms gaan uit, de AI-sleutel wordt leeggemaakt en</w:t>
+            </w:r>
+            <w:r>
+              <w:rPr>
+                <w:lang w:val="nl"/>
+              </w:rPr>
+              <w:t xml:space="preserve"> </w:t>
+            </w:r>
+            <w:r>
+              <w:rPr>
+                <w:rStyle w:val="VerbatimChar"/>
+                <w:lang w:val="nl"/>
+              </w:rPr>
+              <w:t xml:space="preserve">MAIL_OMLEIDEN</w:t>
+            </w:r>
+            <w:r>
+              <w:rPr>
+                <w:lang w:val="nl"/>
+              </w:rPr>
+              <w:t xml:space="preserve"> </w:t>
+            </w:r>
+            <w:r>
+              <w:rPr>
+                <w:lang w:val="nl"/>
+              </w:rPr>
+              <w:t xml:space="preserve">leidt alle e-mail naar de tester (het script weigert zonder).</w:t>
             </w:r>
           </w:p>
         </w:tc>
@@ -9911,28 +10009,7 @@
               <w:rPr>
                 <w:lang w:val="nl"/>
               </w:rPr>
-              <w:t xml:space="preserve">Alleen via WhatsApp (zie</w:t>
-            </w:r>
-            <w:r>
-              <w:rPr>
-                <w:lang w:val="nl"/>
-              </w:rPr>
-              <w:t xml:space="preserve"> </w:t>
-            </w:r>
-            <w:hyperlink w:anchor="berichten">
-              <w:r>
-                <w:rPr>
-                  <w:rStyle w:val="Hyperlink"/>
-                  <w:lang w:val="nl"/>
-                </w:rPr>
-                <w:t xml:space="preserve">Berichten</w:t>
-              </w:r>
-            </w:hyperlink>
-            <w:r>
-              <w:rPr>
-                <w:lang w:val="nl"/>
-              </w:rPr>
-              <w:t xml:space="preserve">).</w:t>
+              <w:t xml:space="preserve">Nee.</w:t>
             </w:r>
           </w:p>
         </w:tc>
@@ -9962,39 +10039,7 @@
               <w:rPr>
                 <w:lang w:val="nl"/>
               </w:rPr>
-              <w:t xml:space="preserve">Maximaal 12 maanden na de toestemming (</w:t>
-            </w:r>
-            <w:r>
-              <w:rPr>
-                <w:rStyle w:val="VerbatimChar"/>
-                <w:lang w:val="nl"/>
-              </w:rPr>
-              <w:t xml:space="preserve">bewaar.seintje_mnd</w:t>
-            </w:r>
-            <w:r>
-              <w:rPr>
-                <w:lang w:val="nl"/>
-              </w:rPr>
-              <w:t xml:space="preserve">, standaard 12). Na intrekken: anonimiseren volgens</w:t>
-            </w:r>
-            <w:r>
-              <w:rPr>
-                <w:lang w:val="nl"/>
-              </w:rPr>
-              <w:t xml:space="preserve"> </w:t>
-            </w:r>
-            <w:r>
-              <w:rPr>
-                <w:rStyle w:val="VerbatimChar"/>
-                <w:lang w:val="nl"/>
-              </w:rPr>
-              <w:t xml:space="preserve">bewaar.afgewezen_weken</w:t>
-            </w:r>
-            <w:r>
-              <w:rPr>
-                <w:lang w:val="nl"/>
-              </w:rPr>
-              <w:t xml:space="preserve">.</w:t>
+              <w:t xml:space="preserve">Echte gegevens op test: alleen tussen importeren en het script (minuten). Het exportbestand: direct na het script verwijderen, van de server en van de laptop. De geanonimiseerde kopie blijft tot de volgende generale repetitie.</w:t>
             </w:r>
           </w:p>
         </w:tc>
@@ -10024,15 +10069,47 @@
               <w:rPr>
                 <w:lang w:val="nl"/>
               </w:rPr>
-              <w:t xml:space="preserve">Toestemming geven nooit op een GET (mailscanners), alleen na een klik op een knop; intrekken via de afmeldlink of in het portaal.</w:t>
+              <w:t xml:space="preserve">De cron van test staat uit tijdens importeren en anonimiseren; het script draait alleen vanaf de opdrachtregel, alleen op test, alleen met</w:t>
+            </w:r>
+            <w:r>
+              <w:rPr>
+                <w:lang w:val="nl"/>
+              </w:rPr>
+              <w:t xml:space="preserve"> </w:t>
+            </w:r>
+            <w:r>
+              <w:rPr>
+                <w:rStyle w:val="VerbatimChar"/>
+                <w:lang w:val="nl"/>
+              </w:rPr>
+              <w:t xml:space="preserve">--ja</w:t>
+            </w:r>
+            <w:r>
+              <w:rPr>
+                <w:lang w:val="nl"/>
+              </w:rPr>
+              <w:t xml:space="preserve">, in één transactie, en controleert na afloop alle tekstkolommen op overgebleven e-mailadressen, telefoonnummers en IBAN's. Stappen in het Runbook systeembeheer, hoofdstuk "Generale repetitie op test".</w:t>
             </w:r>
           </w:p>
         </w:tc>
       </w:tr>
     </w:tbl>
+    <w:bookmarkEnd w:id="25"/>
+    <w:bookmarkStart w:id="26" w:name="seintje-bij-de-volgende-werving"/>
     <w:p>
       <w:pPr>
-        <w:pStyle w:val="BodyText"/>
+        <w:pStyle w:val="Heading1"/>
+      </w:pPr>
+      <w:r>
+        <w:rPr>
+          <w:lang w:val="nl"/>
+        </w:rPr>
+        <w:t xml:space="preserve">Seintje bij de volgende werving</w:t>
+      </w:r>
+    </w:p>
+    <w:p>
+      <w:pPr>
+        <w:pStyle w:val="BlockText"/>
       </w:pPr>
       <w:r>
         <w:rPr>
@@ -10040,7 +10117,7 @@
           <w:bCs/>
           <w:lang w:val="nl"/>
         </w:rPr>
-        <w:t xml:space="preserve">Seintje buiten het seizoen.</w:t>
+        <w:t xml:space="preserve">In het kort:</w:t>
       </w:r>
       <w:r>
         <w:rPr>
@@ -10052,7 +10129,7 @@
         <w:rPr>
           <w:lang w:val="nl"/>
         </w:rPr>
-        <w:t xml:space="preserve">Staat de aanmelding dicht, dan tonen het aanmeldformulier, de</w:t>
+        <w:t xml:space="preserve">een afgewezen sollicitant kan met één knop vragen om bericht als we weer mensen</w:t>
       </w:r>
       <w:r>
         <w:rPr>
@@ -10064,32 +10141,7 @@
         <w:rPr>
           <w:lang w:val="nl"/>
         </w:rPr>
-        <w:t xml:space="preserve">wervingspagina's en het formulier op paal13.com een klein formulier: "laat je e-mailadres achter,</w:t>
-      </w:r>
-      <w:r>
-        <w:rPr>
-          <w:lang w:val="nl"/>
-        </w:rPr>
-        <w:t xml:space="preserve"> </w:t>
-      </w:r>
-      <w:r>
-        <w:rPr>
-          <w:lang w:val="nl"/>
-        </w:rPr>
-        <w:t xml:space="preserve">dan sturen we je één bericht zodra je je kunt aanmelden" (</w:t>
-      </w:r>
-      <w:r>
-        <w:rPr>
-          <w:rStyle w:val="VerbatimChar"/>
-          <w:lang w:val="nl"/>
-        </w:rPr>
-        <w:t xml:space="preserve">includes/seintje_werving.php</w:t>
-      </w:r>
-      <w:r>
-        <w:rPr>
-          <w:lang w:val="nl"/>
-        </w:rPr>
-        <w:t xml:space="preserve">).</w:t>
+        <w:t xml:space="preserve">zoeken. Dat is toestemming, apart gegeven en net zo makkelijk in te trekken.</w:t>
       </w:r>
     </w:p>
     <w:tbl>
@@ -10160,6 +10212,456 @@
               <w:rPr>
                 <w:lang w:val="nl"/>
               </w:rPr>
+              <w:t xml:space="preserve">Afgewezen sollicitanten die dat willen, benaderen bij een volgende werving.</w:t>
+            </w:r>
+          </w:p>
+        </w:tc>
+      </w:tr>
+      <w:tr>
+        <w:tc>
+          <w:tcPr/>
+          <w:p>
+            <w:pPr>
+              <w:pStyle w:val="Compact"/>
+            </w:pPr>
+            <w:r>
+              <w:rPr>
+                <w:lang w:val="nl"/>
+              </w:rPr>
+              <w:t xml:space="preserve">Grondslag</w:t>
+            </w:r>
+          </w:p>
+        </w:tc>
+        <w:tc>
+          <w:tcPr/>
+          <w:p>
+            <w:pPr>
+              <w:pStyle w:val="Compact"/>
+            </w:pPr>
+            <w:r>
+              <w:rPr>
+                <w:lang w:val="nl"/>
+              </w:rPr>
+              <w:t xml:space="preserve">Art. 6 lid 1 sub a AVG, toestemming, los gegeven (art. 7) en vereist voor ongevraagde berichten (Telecommunicatiewet art. 11.7). Oud-strandwachten (ooit aangenomen) benaderen we op grond van gerechtvaardigd belang (art. 6 lid 1 sub f), met een afmeldlink als bezwaarmogelijkheid; dat staat in de privacyverklaring.</w:t>
+            </w:r>
+          </w:p>
+        </w:tc>
+      </w:tr>
+      <w:tr>
+        <w:tc>
+          <w:tcPr/>
+          <w:p>
+            <w:pPr>
+              <w:pStyle w:val="Compact"/>
+            </w:pPr>
+            <w:r>
+              <w:rPr>
+                <w:lang w:val="nl"/>
+              </w:rPr>
+              <w:t xml:space="preserve">Betrokkenen</w:t>
+            </w:r>
+          </w:p>
+        </w:tc>
+        <w:tc>
+          <w:tcPr/>
+          <w:p>
+            <w:pPr>
+              <w:pStyle w:val="Compact"/>
+            </w:pPr>
+            <w:r>
+              <w:rPr>
+                <w:lang w:val="nl"/>
+              </w:rPr>
+              <w:t xml:space="preserve">Afgewezen sollicitanten; oud-strandwachten.</w:t>
+            </w:r>
+          </w:p>
+        </w:tc>
+      </w:tr>
+      <w:tr>
+        <w:tc>
+          <w:tcPr/>
+          <w:p>
+            <w:pPr>
+              <w:pStyle w:val="Compact"/>
+            </w:pPr>
+            <w:r>
+              <w:rPr>
+                <w:lang w:val="nl"/>
+              </w:rPr>
+              <w:t xml:space="preserve">Persoonsgegevens</w:t>
+            </w:r>
+          </w:p>
+        </w:tc>
+        <w:tc>
+          <w:tcPr/>
+          <w:p>
+            <w:pPr>
+              <w:pStyle w:val="Compact"/>
+            </w:pPr>
+            <w:r>
+              <w:rPr>
+                <w:lang w:val="nl"/>
+              </w:rPr>
+              <w:t xml:space="preserve">Moment en bron van de toestemming (</w:t>
+            </w:r>
+            <w:r>
+              <w:rPr>
+                <w:rStyle w:val="VerbatimChar"/>
+                <w:lang w:val="nl"/>
+              </w:rPr>
+              <w:t xml:space="preserve">personen.seintje_op</w:t>
+            </w:r>
+            <w:r>
+              <w:rPr>
+                <w:lang w:val="nl"/>
+              </w:rPr>
+              <w:t xml:space="preserve">,</w:t>
+            </w:r>
+            <w:r>
+              <w:rPr>
+                <w:lang w:val="nl"/>
+              </w:rPr>
+              <w:t xml:space="preserve"> </w:t>
+            </w:r>
+            <w:r>
+              <w:rPr>
+                <w:rStyle w:val="VerbatimChar"/>
+                <w:lang w:val="nl"/>
+              </w:rPr>
+              <w:t xml:space="preserve">seintje_bron</w:t>
+            </w:r>
+            <w:r>
+              <w:rPr>
+                <w:lang w:val="nl"/>
+              </w:rPr>
+              <w:t xml:space="preserve">), afmeldtoken, en de gegevens van het dossier die zolang blijven staan.</w:t>
+            </w:r>
+          </w:p>
+        </w:tc>
+      </w:tr>
+      <w:tr>
+        <w:tc>
+          <w:tcPr/>
+          <w:p>
+            <w:pPr>
+              <w:pStyle w:val="Compact"/>
+            </w:pPr>
+            <w:r>
+              <w:rPr>
+                <w:lang w:val="nl"/>
+              </w:rPr>
+              <w:t xml:space="preserve">Ontvangers en verwerkers</w:t>
+            </w:r>
+          </w:p>
+        </w:tc>
+        <w:tc>
+          <w:tcPr/>
+          <w:p>
+            <w:pPr>
+              <w:pStyle w:val="Compact"/>
+            </w:pPr>
+            <w:r>
+              <w:rPr>
+                <w:lang w:val="nl"/>
+              </w:rPr>
+              <w:t xml:space="preserve">Bestuur (module</w:t>
+            </w:r>
+            <w:r>
+              <w:rPr>
+                <w:lang w:val="nl"/>
+              </w:rPr>
+              <w:t xml:space="preserve"> </w:t>
+            </w:r>
+            <w:r>
+              <w:rPr>
+                <w:rStyle w:val="VerbatimChar"/>
+                <w:lang w:val="nl"/>
+              </w:rPr>
+              <w:t xml:space="preserve">mailing</w:t>
+            </w:r>
+            <w:r>
+              <w:rPr>
+                <w:lang w:val="nl"/>
+              </w:rPr>
+              <w:t xml:space="preserve">). E-mailprovider, eventueel WhatsReach of sms-dienst.</w:t>
+            </w:r>
+          </w:p>
+        </w:tc>
+      </w:tr>
+      <w:tr>
+        <w:tc>
+          <w:tcPr/>
+          <w:p>
+            <w:pPr>
+              <w:pStyle w:val="Compact"/>
+            </w:pPr>
+            <w:r>
+              <w:rPr>
+                <w:lang w:val="nl"/>
+              </w:rPr>
+              <w:t xml:space="preserve">Doorgifte buiten de EER</w:t>
+            </w:r>
+          </w:p>
+        </w:tc>
+        <w:tc>
+          <w:tcPr/>
+          <w:p>
+            <w:pPr>
+              <w:pStyle w:val="Compact"/>
+            </w:pPr>
+            <w:r>
+              <w:rPr>
+                <w:lang w:val="nl"/>
+              </w:rPr>
+              <w:t xml:space="preserve">Alleen via WhatsApp (zie</w:t>
+            </w:r>
+            <w:r>
+              <w:rPr>
+                <w:lang w:val="nl"/>
+              </w:rPr>
+              <w:t xml:space="preserve"> </w:t>
+            </w:r>
+            <w:hyperlink w:anchor="berichten">
+              <w:r>
+                <w:rPr>
+                  <w:rStyle w:val="Hyperlink"/>
+                  <w:lang w:val="nl"/>
+                </w:rPr>
+                <w:t xml:space="preserve">Berichten</w:t>
+              </w:r>
+            </w:hyperlink>
+            <w:r>
+              <w:rPr>
+                <w:lang w:val="nl"/>
+              </w:rPr>
+              <w:t xml:space="preserve">).</w:t>
+            </w:r>
+          </w:p>
+        </w:tc>
+      </w:tr>
+      <w:tr>
+        <w:tc>
+          <w:tcPr/>
+          <w:p>
+            <w:pPr>
+              <w:pStyle w:val="Compact"/>
+            </w:pPr>
+            <w:r>
+              <w:rPr>
+                <w:lang w:val="nl"/>
+              </w:rPr>
+              <w:t xml:space="preserve">Bewaartermijn</w:t>
+            </w:r>
+          </w:p>
+        </w:tc>
+        <w:tc>
+          <w:tcPr/>
+          <w:p>
+            <w:pPr>
+              <w:pStyle w:val="Compact"/>
+            </w:pPr>
+            <w:r>
+              <w:rPr>
+                <w:lang w:val="nl"/>
+              </w:rPr>
+              <w:t xml:space="preserve">Maximaal 12 maanden na de toestemming (</w:t>
+            </w:r>
+            <w:r>
+              <w:rPr>
+                <w:rStyle w:val="VerbatimChar"/>
+                <w:lang w:val="nl"/>
+              </w:rPr>
+              <w:t xml:space="preserve">bewaar.seintje_mnd</w:t>
+            </w:r>
+            <w:r>
+              <w:rPr>
+                <w:lang w:val="nl"/>
+              </w:rPr>
+              <w:t xml:space="preserve">, standaard 12). Na intrekken: anonimiseren volgens</w:t>
+            </w:r>
+            <w:r>
+              <w:rPr>
+                <w:lang w:val="nl"/>
+              </w:rPr>
+              <w:t xml:space="preserve"> </w:t>
+            </w:r>
+            <w:r>
+              <w:rPr>
+                <w:rStyle w:val="VerbatimChar"/>
+                <w:lang w:val="nl"/>
+              </w:rPr>
+              <w:t xml:space="preserve">bewaar.afgewezen_weken</w:t>
+            </w:r>
+            <w:r>
+              <w:rPr>
+                <w:lang w:val="nl"/>
+              </w:rPr>
+              <w:t xml:space="preserve">.</w:t>
+            </w:r>
+          </w:p>
+        </w:tc>
+      </w:tr>
+      <w:tr>
+        <w:tc>
+          <w:tcPr/>
+          <w:p>
+            <w:pPr>
+              <w:pStyle w:val="Compact"/>
+            </w:pPr>
+            <w:r>
+              <w:rPr>
+                <w:lang w:val="nl"/>
+              </w:rPr>
+              <w:t xml:space="preserve">Beveiliging</w:t>
+            </w:r>
+          </w:p>
+        </w:tc>
+        <w:tc>
+          <w:tcPr/>
+          <w:p>
+            <w:pPr>
+              <w:pStyle w:val="Compact"/>
+            </w:pPr>
+            <w:r>
+              <w:rPr>
+                <w:lang w:val="nl"/>
+              </w:rPr>
+              <w:t xml:space="preserve">Toestemming geven nooit op een GET (mailscanners), alleen na een klik op een knop; intrekken via de afmeldlink of in het portaal.</w:t>
+            </w:r>
+          </w:p>
+        </w:tc>
+      </w:tr>
+    </w:tbl>
+    <w:p>
+      <w:pPr>
+        <w:pStyle w:val="BodyText"/>
+      </w:pPr>
+      <w:r>
+        <w:rPr>
+          <w:b/>
+          <w:bCs/>
+          <w:lang w:val="nl"/>
+        </w:rPr>
+        <w:t xml:space="preserve">Seintje buiten het seizoen.</w:t>
+      </w:r>
+      <w:r>
+        <w:rPr>
+          <w:lang w:val="nl"/>
+        </w:rPr>
+        <w:t xml:space="preserve"> </w:t>
+      </w:r>
+      <w:r>
+        <w:rPr>
+          <w:lang w:val="nl"/>
+        </w:rPr>
+        <w:t xml:space="preserve">Staat de aanmelding dicht, dan tonen het aanmeldformulier, de</w:t>
+      </w:r>
+      <w:r>
+        <w:rPr>
+          <w:lang w:val="nl"/>
+        </w:rPr>
+        <w:t xml:space="preserve"> </w:t>
+      </w:r>
+      <w:r>
+        <w:rPr>
+          <w:lang w:val="nl"/>
+        </w:rPr>
+        <w:t xml:space="preserve">wervingspagina's en het formulier op paal13.com een klein formulier: "laat je e-mailadres achter,</w:t>
+      </w:r>
+      <w:r>
+        <w:rPr>
+          <w:lang w:val="nl"/>
+        </w:rPr>
+        <w:t xml:space="preserve"> </w:t>
+      </w:r>
+      <w:r>
+        <w:rPr>
+          <w:lang w:val="nl"/>
+        </w:rPr>
+        <w:t xml:space="preserve">dan sturen we je één bericht zodra je je kunt aanmelden" (</w:t>
+      </w:r>
+      <w:r>
+        <w:rPr>
+          <w:rStyle w:val="VerbatimChar"/>
+          <w:lang w:val="nl"/>
+        </w:rPr>
+        <w:t xml:space="preserve">includes/seintje_werving.php</w:t>
+      </w:r>
+      <w:r>
+        <w:rPr>
+          <w:lang w:val="nl"/>
+        </w:rPr>
+        <w:t xml:space="preserve">).</w:t>
+      </w:r>
+    </w:p>
+    <w:tbl>
+      <w:tblPr>
+        <w:tblStyle w:val="Table"/>
+        <w:tblW w:type="auto" w:w="0"/>
+        <w:tblLook w:firstRow="1" w:lastRow="0" w:firstColumn="0" w:lastColumn="0" w:noHBand="0" w:noVBand="0" w:val="0020"/>
+      </w:tblPr>
+      <w:tblGrid>
+        <w:gridCol w:w="3960"/>
+        <w:gridCol w:w="3960"/>
+      </w:tblGrid>
+      <w:tr>
+        <w:trPr>
+          <w:tblHeader w:val="on"/>
+        </w:trPr>
+        <w:tc>
+          <w:tcPr/>
+          <w:p>
+            <w:pPr>
+              <w:pStyle w:val="Compact"/>
+            </w:pPr>
+            <w:r>
+              <w:rPr>
+                <w:lang w:val="nl"/>
+              </w:rPr>
+              <w:t xml:space="preserve">Onderdeel</w:t>
+            </w:r>
+          </w:p>
+        </w:tc>
+        <w:tc>
+          <w:tcPr/>
+          <w:p>
+            <w:pPr>
+              <w:pStyle w:val="Compact"/>
+            </w:pPr>
+            <w:r>
+              <w:rPr>
+                <w:lang w:val="nl"/>
+              </w:rPr>
+              <w:t xml:space="preserve">Inhoud</w:t>
+            </w:r>
+          </w:p>
+        </w:tc>
+      </w:tr>
+      <w:tr>
+        <w:tc>
+          <w:tcPr/>
+          <w:p>
+            <w:pPr>
+              <w:pStyle w:val="Compact"/>
+            </w:pPr>
+            <w:r>
+              <w:rPr>
+                <w:lang w:val="nl"/>
+              </w:rPr>
+              <w:t xml:space="preserve">Doel</w:t>
+            </w:r>
+          </w:p>
+        </w:tc>
+        <w:tc>
+          <w:tcPr/>
+          <w:p>
+            <w:pPr>
+              <w:pStyle w:val="Compact"/>
+            </w:pPr>
+            <w:r>
+              <w:rPr>
+                <w:lang w:val="nl"/>
+              </w:rPr>
               <w:t xml:space="preserve">Mensen die nog niet solliciteerden één bericht sturen als de aanmelding opengaat.</w:t>
             </w:r>
           </w:p>
@@ -10551,8 +11053,8 @@
         </w:tc>
       </w:tr>
     </w:tbl>
-    <w:bookmarkEnd w:id="25"/>
-    <w:bookmarkStart w:id="26" w:name="bijzonderheden"/>
+    <w:bookmarkEnd w:id="26"/>
+    <w:bookmarkStart w:id="27" w:name="bijzonderheden"/>
     <w:p>
       <w:pPr>
         <w:pStyle w:val="Heading1"/>
@@ -11042,8 +11544,8 @@
         <w:t xml:space="preserve">, logs of berichten.</w:t>
       </w:r>
     </w:p>
-    <w:bookmarkEnd w:id="26"/>
-    <w:bookmarkStart w:id="27" w:name="rechten-van-betrokkenen"/>
+    <w:bookmarkEnd w:id="27"/>
+    <w:bookmarkStart w:id="28" w:name="rechten-van-betrokkenen"/>
     <w:p>
       <w:pPr>
         <w:pStyle w:val="Heading1"/>
@@ -11428,8 +11930,8 @@
         <w:t xml:space="preserve">de verkeerde persoon terechtkomen. Klachten kunnen bij de Autoriteit Persoonsgegevens.</w:t>
       </w:r>
     </w:p>
-    <w:bookmarkEnd w:id="27"/>
-    <w:bookmarkStart w:id="28" w:name="datalekken"/>
+    <w:bookmarkEnd w:id="28"/>
+    <w:bookmarkStart w:id="29" w:name="datalekken"/>
     <w:p>
       <w:pPr>
         <w:pStyle w:val="Heading1"/>
@@ -11568,8 +12070,8 @@
         <w:t xml:space="preserve">gebruiken. Het datalekregister zelf houdt het bestuur buiten dit systeem bij.</w:t>
       </w:r>
     </w:p>
-    <w:bookmarkEnd w:id="28"/>
-    <w:bookmarkStart w:id="29" w:name="nog-vast-te-leggen"/>
+    <w:bookmarkEnd w:id="29"/>
+    <w:bookmarkStart w:id="30" w:name="nog-vast-te-leggen"/>
     <w:p>
       <w:pPr>
         <w:pStyle w:val="Heading1"/>
@@ -11877,8 +12379,8 @@
         <w:t xml:space="preserve">selectie).</w:t>
       </w:r>
     </w:p>
-    <w:bookmarkEnd w:id="29"/>
-    <w:bookmarkStart w:id="30" w:name="wijzigingen"/>
+    <w:bookmarkEnd w:id="30"/>
+    <w:bookmarkStart w:id="31" w:name="wijzigingen"/>
     <w:p>
       <w:pPr>
         <w:pStyle w:val="Heading1"/>
@@ -12337,8 +12839,57 @@
           </w:p>
         </w:tc>
       </w:tr>
+      <w:tr>
+        <w:tc>
+          <w:tcPr/>
+          <w:p>
+            <w:pPr>
+              <w:pStyle w:val="Compact"/>
+            </w:pPr>
+            <w:r>
+              <w:rPr>
+                <w:lang w:val="nl"/>
+              </w:rPr>
+              <w:t xml:space="preserve">28 september 2026</w:t>
+            </w:r>
+          </w:p>
+        </w:tc>
+        <w:tc>
+          <w:tcPr/>
+          <w:p>
+            <w:pPr>
+              <w:pStyle w:val="Compact"/>
+            </w:pPr>
+            <w:r>
+              <w:rPr>
+                <w:lang w:val="nl"/>
+              </w:rPr>
+              <w:t xml:space="preserve">Nieuwe verwerking: productiekopie op de testomgeving (generale repetitie vóór elke uitrol), direct geanonimiseerd met</w:t>
+            </w:r>
+            <w:r>
+              <w:rPr>
+                <w:lang w:val="nl"/>
+              </w:rPr>
+              <w:t xml:space="preserve"> </w:t>
+            </w:r>
+            <w:r>
+              <w:rPr>
+                <w:rStyle w:val="VerbatimChar"/>
+                <w:lang w:val="nl"/>
+              </w:rPr>
+              <w:t xml:space="preserve">tools/anonimiseer_testkopie.php</w:t>
+            </w:r>
+            <w:r>
+              <w:rPr>
+                <w:lang w:val="nl"/>
+              </w:rPr>
+              <w:t xml:space="preserve">; exportbestand direct weg. Interne verwerking bij dezelfde hoster, geen wijziging in de privacyverklaring nodig.</w:t>
+            </w:r>
+          </w:p>
+        </w:tc>
+      </w:tr>
     </w:tbl>
-    <w:bookmarkEnd w:id="30"/>
+    <w:bookmarkEnd w:id="31"/>
     <w:sectPr>
       <w:footnotePr>
         <w:numRestart w:val="eachSect"/>

</xml_diff>